<commit_message>
updates - drop rearrangement, sample control plots near treatments, sample complete burning transects
</commit_message>
<xml_diff>
--- a/documents/Generating Radial Lines.docx
+++ b/documents/Generating Radial Lines.docx
@@ -51,7 +51,13 @@
         </w:numPr>
       </w:pPr>
       <w:r>
-        <w:t>Use the Radial Lines input created in R and the Bearing to Distance tool in ArcGIS</w:t>
+        <w:t xml:space="preserve">Use the Radial Lines input created in R and the Bearing Distance </w:t>
+      </w:r>
+      <w:r>
+        <w:t xml:space="preserve">to Line </w:t>
+      </w:r>
+      <w:r>
+        <w:t>tool in ArcGIS</w:t>
       </w:r>
     </w:p>
     <w:p>
@@ -236,7 +242,19 @@
         <w:t xml:space="preserve">. You will have to </w:t>
       </w:r>
       <w:r>
-        <w:t>take out the Date fields for export.</w:t>
+        <w:t xml:space="preserve">take out the Date </w:t>
+      </w:r>
+      <w:r>
+        <w:t xml:space="preserve">and </w:t>
+      </w:r>
+      <w:r>
+        <w:t>fields</w:t>
+      </w:r>
+      <w:r>
+        <w:t xml:space="preserve"> starting with “FID” (FID_RadialLines… &amp; FID_Fires)</w:t>
+      </w:r>
+      <w:r>
+        <w:t xml:space="preserve"> for export.</w:t>
       </w:r>
       <w:r>
         <w:t xml:space="preserve"> You can also remove duplicate fields (ending in “_1”)</w:t>
@@ -321,6 +339,9 @@
         <w:ind w:left="1440"/>
       </w:pPr>
       <w:r>
+        <w:rPr>
+          <w:noProof/>
+        </w:rPr>
         <w:drawing>
           <wp:inline distT="0" distB="0" distL="0" distR="0" wp14:anchorId="3713BE08" wp14:editId="0B6E0EED">
             <wp:extent cx="4464279" cy="3454578"/>

</xml_diff>